<commit_message>
fix( docs calendar )
</commit_message>
<xml_diff>
--- a/docs/Описание_MDMTSP_КТ1.docx
+++ b/docs/Описание_MDMTSP_КТ1.docx
@@ -222,45 +222,7 @@
           <w:szCs w:val="28"/>
           <w:lang w:val="ru-RU"/>
         </w:rPr>
-        <w:t xml:space="preserve"> решений при </w:t>
-      </w:r>
-      <w:proofErr w:type="gramStart"/>
-      <w:r>
-        <w:rPr>
-          <w:rFonts w:ascii="Times New Roman" w:hAnsi="Times New Roman" w:cs="Times New Roman"/>
-          <w:sz w:val="28"/>
-          <w:szCs w:val="28"/>
-          <w:lang w:val="ru-RU"/>
-        </w:rPr>
-        <w:t xml:space="preserve">работе </w:t>
-      </w:r>
-      <w:r>
-        <w:rPr>
-          <w:rFonts w:ascii="Times New Roman" w:hAnsi="Times New Roman" w:cs="Times New Roman"/>
-          <w:sz w:val="28"/>
-          <w:szCs w:val="28"/>
-          <w:lang w:val="ru-RU"/>
-        </w:rPr>
-        <w:t xml:space="preserve"> </w:t>
-      </w:r>
-      <w:r>
-        <w:rPr>
-          <w:rFonts w:ascii="Times New Roman" w:hAnsi="Times New Roman" w:cs="Times New Roman"/>
-          <w:sz w:val="28"/>
-          <w:szCs w:val="28"/>
-          <w:lang w:val="ru-RU"/>
-        </w:rPr>
-        <w:t>с</w:t>
-      </w:r>
-      <w:proofErr w:type="gramEnd"/>
-      <w:r>
-        <w:rPr>
-          <w:rFonts w:ascii="Times New Roman" w:hAnsi="Times New Roman" w:cs="Times New Roman"/>
-          <w:sz w:val="28"/>
-          <w:szCs w:val="28"/>
-          <w:lang w:val="ru-RU"/>
-        </w:rPr>
-        <w:t xml:space="preserve"> данными большой размерности.</w:t>
+        <w:t xml:space="preserve"> решений при работе с данными большой размерности.</w:t>
       </w:r>
     </w:p>
     <w:p>
@@ -612,6 +574,17 @@
           <w:lang w:val="ru-RU"/>
         </w:rPr>
       </w:pPr>
+    </w:p>
+    <w:p>
+      <w:pPr>
+        <w:jc w:val="both"/>
+        <w:rPr>
+          <w:rFonts w:ascii="Times New Roman" w:hAnsi="Times New Roman" w:cs="Times New Roman"/>
+          <w:sz w:val="28"/>
+          <w:szCs w:val="28"/>
+          <w:lang w:val="ru-RU"/>
+        </w:rPr>
+      </w:pPr>
       <w:r>
         <w:rPr>
           <w:rFonts w:ascii="Times New Roman" w:hAnsi="Times New Roman" w:cs="Times New Roman"/>
@@ -621,6 +594,7 @@
           <w:szCs w:val="28"/>
           <w:lang w:val="ru-RU"/>
         </w:rPr>
+        <w:lastRenderedPageBreak/>
         <w:t>Краткое описание гипотезы:</w:t>
       </w:r>
       <w:r>
@@ -630,7 +604,7 @@
           <w:szCs w:val="28"/>
           <w:lang w:val="ru-RU"/>
         </w:rPr>
-        <w:t xml:space="preserve"> использование комбинированных эвристических подходов к задаче нескольких коммивояжёров с </w:t>
+        <w:t xml:space="preserve"> </w:t>
       </w:r>
       <w:r>
         <w:rPr>
@@ -639,10 +613,8 @@
           <w:szCs w:val="28"/>
           <w:lang w:val="ru-RU"/>
         </w:rPr>
-        <w:lastRenderedPageBreak/>
-        <w:t xml:space="preserve">несколькими депо, основанных на разделении задачи на этапы распределения, маршрутизации и последующего локального улучшения с </w:t>
+        <w:t>п</w:t>
       </w:r>
-      <w:proofErr w:type="spellStart"/>
       <w:r>
         <w:rPr>
           <w:rFonts w:ascii="Times New Roman" w:hAnsi="Times New Roman" w:cs="Times New Roman"/>
@@ -650,9 +622,16 @@
           <w:szCs w:val="28"/>
           <w:lang w:val="ru-RU"/>
         </w:rPr>
-        <w:t>межмаршрутными</w:t>
+        <w:t xml:space="preserve">редполагается, что </w:t>
       </w:r>
-      <w:proofErr w:type="spellEnd"/>
+      <w:r>
+        <w:rPr>
+          <w:rFonts w:ascii="Times New Roman" w:hAnsi="Times New Roman" w:cs="Times New Roman"/>
+          <w:sz w:val="28"/>
+          <w:szCs w:val="28"/>
+        </w:rPr>
+        <w:t>MDMTSP</w:t>
+      </w:r>
       <w:r>
         <w:rPr>
           <w:rFonts w:ascii="Times New Roman" w:hAnsi="Times New Roman" w:cs="Times New Roman"/>
@@ -660,7 +639,7 @@
           <w:szCs w:val="28"/>
           <w:lang w:val="ru-RU"/>
         </w:rPr>
-        <w:t xml:space="preserve"> операторами, позволяет существенно повысить качество решений и вычислительную эффективность по сравнению с прямыми или наивными методами, особенно на задачах большой размерности и с несколькими депо.</w:t>
+        <w:t xml:space="preserve"> можно решать эффективнее, если сначала распределять клиентов между депо и агентами, затем строить маршруты внутри групп, а после этого улучшать решение межмаршрутными эвристиками (переносы, перестановки, локальный поиск). Ожидается, что такая комбинация даст более стабильный и выгодный компромисс между качеством решения и временем расчёта, особенно на крупных инстансах и в многодепо сценариях, по сравнению с простыми базовыми или стандартными конфигурациями универсальных решателей.</w:t>
       </w:r>
     </w:p>
     <w:p>
@@ -1146,6 +1125,7 @@
                 <w:rFonts w:ascii="Times New Roman" w:hAnsi="Times New Roman" w:cs="Times New Roman"/>
                 <w:lang w:val="ru-RU"/>
               </w:rPr>
+              <w:lastRenderedPageBreak/>
               <w:t>Переход к многомаршрутным и многодепо постановкам</w:t>
             </w:r>
           </w:p>
@@ -1268,7 +1248,6 @@
                 <w:rFonts w:ascii="Times New Roman" w:hAnsi="Times New Roman" w:cs="Times New Roman"/>
                 <w:lang w:val="ru-RU"/>
               </w:rPr>
-              <w:lastRenderedPageBreak/>
               <w:t>Проектирование и разработка системы валидации решений</w:t>
             </w:r>
           </w:p>
@@ -1554,7 +1533,39 @@
                 <w:b/>
                 <w:spacing w:val="-2"/>
               </w:rPr>
-              <w:t>11.02.2026–17.03.2026</w:t>
+              <w:t>11.02.2026–</w:t>
+            </w:r>
+            <w:r>
+              <w:rPr>
+                <w:rFonts w:ascii="Times New Roman" w:hAnsi="Times New Roman" w:cs="Times New Roman"/>
+                <w:b/>
+                <w:spacing w:val="-2"/>
+              </w:rPr>
+              <w:t>24</w:t>
+            </w:r>
+            <w:r>
+              <w:rPr>
+                <w:rFonts w:ascii="Times New Roman" w:hAnsi="Times New Roman" w:cs="Times New Roman"/>
+                <w:b/>
+                <w:spacing w:val="-2"/>
+              </w:rPr>
+              <w:t>.0</w:t>
+            </w:r>
+            <w:r>
+              <w:rPr>
+                <w:rFonts w:ascii="Times New Roman" w:hAnsi="Times New Roman" w:cs="Times New Roman"/>
+                <w:b/>
+                <w:spacing w:val="-2"/>
+              </w:rPr>
+              <w:t>2</w:t>
+            </w:r>
+            <w:r>
+              <w:rPr>
+                <w:rFonts w:ascii="Times New Roman" w:hAnsi="Times New Roman" w:cs="Times New Roman"/>
+                <w:b/>
+                <w:spacing w:val="-2"/>
+              </w:rPr>
+              <w:t>.2026</w:t>
             </w:r>
           </w:p>
           <w:p>
@@ -1650,7 +1661,63 @@
                 <w:b/>
                 <w:spacing w:val="-2"/>
               </w:rPr>
-              <w:t>18.03.2026–07.04.2026</w:t>
+              <w:t>25.</w:t>
+            </w:r>
+            <w:r>
+              <w:rPr>
+                <w:rFonts w:ascii="Times New Roman" w:hAnsi="Times New Roman" w:cs="Times New Roman"/>
+                <w:b/>
+                <w:spacing w:val="-2"/>
+              </w:rPr>
+              <w:t>0</w:t>
+            </w:r>
+            <w:r>
+              <w:rPr>
+                <w:rFonts w:ascii="Times New Roman" w:hAnsi="Times New Roman" w:cs="Times New Roman"/>
+                <w:b/>
+                <w:spacing w:val="-2"/>
+              </w:rPr>
+              <w:t>2</w:t>
+            </w:r>
+            <w:r>
+              <w:rPr>
+                <w:rFonts w:ascii="Times New Roman" w:hAnsi="Times New Roman" w:cs="Times New Roman"/>
+                <w:b/>
+                <w:spacing w:val="-2"/>
+              </w:rPr>
+              <w:t>.2026–</w:t>
+            </w:r>
+            <w:r>
+              <w:rPr>
+                <w:rFonts w:ascii="Times New Roman" w:hAnsi="Times New Roman" w:cs="Times New Roman"/>
+                <w:b/>
+                <w:spacing w:val="-2"/>
+              </w:rPr>
+              <w:t>28</w:t>
+            </w:r>
+            <w:r>
+              <w:rPr>
+                <w:rFonts w:ascii="Times New Roman" w:hAnsi="Times New Roman" w:cs="Times New Roman"/>
+                <w:b/>
+                <w:spacing w:val="-2"/>
+              </w:rPr>
+              <w:t>.0</w:t>
+            </w:r>
+            <w:r>
+              <w:rPr>
+                <w:rFonts w:ascii="Times New Roman" w:hAnsi="Times New Roman" w:cs="Times New Roman"/>
+                <w:b/>
+                <w:spacing w:val="-2"/>
+              </w:rPr>
+              <w:t>2</w:t>
+            </w:r>
+            <w:r>
+              <w:rPr>
+                <w:rFonts w:ascii="Times New Roman" w:hAnsi="Times New Roman" w:cs="Times New Roman"/>
+                <w:b/>
+                <w:spacing w:val="-2"/>
+              </w:rPr>
+              <w:t>.2026</w:t>
             </w:r>
           </w:p>
           <w:p>
@@ -1770,7 +1837,63 @@
                 <w:b/>
                 <w:spacing w:val="-2"/>
               </w:rPr>
-              <w:t>08.04.2026–05.05.2026</w:t>
+              <w:t>01</w:t>
+            </w:r>
+            <w:r>
+              <w:rPr>
+                <w:rFonts w:ascii="Times New Roman" w:hAnsi="Times New Roman" w:cs="Times New Roman"/>
+                <w:b/>
+                <w:spacing w:val="-2"/>
+              </w:rPr>
+              <w:t>.0</w:t>
+            </w:r>
+            <w:r>
+              <w:rPr>
+                <w:rFonts w:ascii="Times New Roman" w:hAnsi="Times New Roman" w:cs="Times New Roman"/>
+                <w:b/>
+                <w:spacing w:val="-2"/>
+              </w:rPr>
+              <w:t>3</w:t>
+            </w:r>
+            <w:r>
+              <w:rPr>
+                <w:rFonts w:ascii="Times New Roman" w:hAnsi="Times New Roman" w:cs="Times New Roman"/>
+                <w:b/>
+                <w:spacing w:val="-2"/>
+              </w:rPr>
+              <w:t>.2026–</w:t>
+            </w:r>
+            <w:r>
+              <w:rPr>
+                <w:rFonts w:ascii="Times New Roman" w:hAnsi="Times New Roman" w:cs="Times New Roman"/>
+                <w:b/>
+                <w:spacing w:val="-2"/>
+              </w:rPr>
+              <w:t>14</w:t>
+            </w:r>
+            <w:r>
+              <w:rPr>
+                <w:rFonts w:ascii="Times New Roman" w:hAnsi="Times New Roman" w:cs="Times New Roman"/>
+                <w:b/>
+                <w:spacing w:val="-2"/>
+              </w:rPr>
+              <w:t>.0</w:t>
+            </w:r>
+            <w:r>
+              <w:rPr>
+                <w:rFonts w:ascii="Times New Roman" w:hAnsi="Times New Roman" w:cs="Times New Roman"/>
+                <w:b/>
+                <w:spacing w:val="-2"/>
+              </w:rPr>
+              <w:t>3</w:t>
+            </w:r>
+            <w:r>
+              <w:rPr>
+                <w:rFonts w:ascii="Times New Roman" w:hAnsi="Times New Roman" w:cs="Times New Roman"/>
+                <w:b/>
+                <w:spacing w:val="-2"/>
+              </w:rPr>
+              <w:t>.2026</w:t>
             </w:r>
           </w:p>
           <w:p>
@@ -1885,7 +2008,63 @@
                 <w:b/>
                 <w:spacing w:val="-2"/>
               </w:rPr>
-              <w:t>06.05.2026–25.05.2026</w:t>
+              <w:t>15</w:t>
+            </w:r>
+            <w:r>
+              <w:rPr>
+                <w:rFonts w:ascii="Times New Roman" w:hAnsi="Times New Roman" w:cs="Times New Roman"/>
+                <w:b/>
+                <w:spacing w:val="-2"/>
+              </w:rPr>
+              <w:t>.0</w:t>
+            </w:r>
+            <w:r>
+              <w:rPr>
+                <w:rFonts w:ascii="Times New Roman" w:hAnsi="Times New Roman" w:cs="Times New Roman"/>
+                <w:b/>
+                <w:spacing w:val="-2"/>
+              </w:rPr>
+              <w:t>3</w:t>
+            </w:r>
+            <w:r>
+              <w:rPr>
+                <w:rFonts w:ascii="Times New Roman" w:hAnsi="Times New Roman" w:cs="Times New Roman"/>
+                <w:b/>
+                <w:spacing w:val="-2"/>
+              </w:rPr>
+              <w:t>.2026–2</w:t>
+            </w:r>
+            <w:r>
+              <w:rPr>
+                <w:rFonts w:ascii="Times New Roman" w:hAnsi="Times New Roman" w:cs="Times New Roman"/>
+                <w:b/>
+                <w:spacing w:val="-2"/>
+              </w:rPr>
+              <w:t>7</w:t>
+            </w:r>
+            <w:r>
+              <w:rPr>
+                <w:rFonts w:ascii="Times New Roman" w:hAnsi="Times New Roman" w:cs="Times New Roman"/>
+                <w:b/>
+                <w:spacing w:val="-2"/>
+              </w:rPr>
+              <w:t>.0</w:t>
+            </w:r>
+            <w:r>
+              <w:rPr>
+                <w:rFonts w:ascii="Times New Roman" w:hAnsi="Times New Roman" w:cs="Times New Roman"/>
+                <w:b/>
+                <w:spacing w:val="-2"/>
+              </w:rPr>
+              <w:t>3</w:t>
+            </w:r>
+            <w:r>
+              <w:rPr>
+                <w:rFonts w:ascii="Times New Roman" w:hAnsi="Times New Roman" w:cs="Times New Roman"/>
+                <w:b/>
+                <w:spacing w:val="-2"/>
+              </w:rPr>
+              <w:t>.2026</w:t>
             </w:r>
           </w:p>
         </w:tc>
@@ -2107,42 +2286,12 @@
                 <w:rFonts w:ascii="Times New Roman" w:hAnsi="Times New Roman" w:cs="Times New Roman"/>
               </w:rPr>
             </w:pPr>
-            <w:proofErr w:type="spellStart"/>
             <w:r>
               <w:rPr>
                 <w:rFonts w:ascii="Times New Roman" w:hAnsi="Times New Roman" w:cs="Times New Roman"/>
               </w:rPr>
-              <w:t>Корректность</w:t>
+              <w:t>Корректность теоретических решений</w:t>
             </w:r>
-            <w:proofErr w:type="spellEnd"/>
-            <w:r>
-              <w:rPr>
-                <w:rFonts w:ascii="Times New Roman" w:hAnsi="Times New Roman" w:cs="Times New Roman"/>
-              </w:rPr>
-              <w:t xml:space="preserve"> </w:t>
-            </w:r>
-            <w:proofErr w:type="spellStart"/>
-            <w:r>
-              <w:rPr>
-                <w:rFonts w:ascii="Times New Roman" w:hAnsi="Times New Roman" w:cs="Times New Roman"/>
-              </w:rPr>
-              <w:t>теоретических</w:t>
-            </w:r>
-            <w:proofErr w:type="spellEnd"/>
-            <w:r>
-              <w:rPr>
-                <w:rFonts w:ascii="Times New Roman" w:hAnsi="Times New Roman" w:cs="Times New Roman"/>
-              </w:rPr>
-              <w:t xml:space="preserve"> </w:t>
-            </w:r>
-            <w:proofErr w:type="spellStart"/>
-            <w:r>
-              <w:rPr>
-                <w:rFonts w:ascii="Times New Roman" w:hAnsi="Times New Roman" w:cs="Times New Roman"/>
-              </w:rPr>
-              <w:t>решений</w:t>
-            </w:r>
-            <w:proofErr w:type="spellEnd"/>
           </w:p>
         </w:tc>
         <w:tc>
@@ -2195,28 +2344,12 @@
                 <w:rFonts w:ascii="Times New Roman" w:hAnsi="Times New Roman" w:cs="Times New Roman"/>
               </w:rPr>
             </w:pPr>
-            <w:proofErr w:type="spellStart"/>
             <w:r>
               <w:rPr>
                 <w:rFonts w:ascii="Times New Roman" w:hAnsi="Times New Roman" w:cs="Times New Roman"/>
               </w:rPr>
-              <w:t>Программная</w:t>
+              <w:t>Программная реализация</w:t>
             </w:r>
-            <w:proofErr w:type="spellEnd"/>
-            <w:r>
-              <w:rPr>
-                <w:rFonts w:ascii="Times New Roman" w:hAnsi="Times New Roman" w:cs="Times New Roman"/>
-              </w:rPr>
-              <w:t xml:space="preserve"> </w:t>
-            </w:r>
-            <w:proofErr w:type="spellStart"/>
-            <w:r>
-              <w:rPr>
-                <w:rFonts w:ascii="Times New Roman" w:hAnsi="Times New Roman" w:cs="Times New Roman"/>
-              </w:rPr>
-              <w:t>реализация</w:t>
-            </w:r>
-            <w:proofErr w:type="spellEnd"/>
           </w:p>
         </w:tc>
         <w:tc>
@@ -2269,42 +2402,12 @@
                 <w:rFonts w:ascii="Times New Roman" w:hAnsi="Times New Roman" w:cs="Times New Roman"/>
               </w:rPr>
             </w:pPr>
-            <w:proofErr w:type="spellStart"/>
             <w:r>
               <w:rPr>
                 <w:rFonts w:ascii="Times New Roman" w:hAnsi="Times New Roman" w:cs="Times New Roman"/>
               </w:rPr>
-              <w:t>Анализ</w:t>
+              <w:t>Анализ результатов экспериментов</w:t>
             </w:r>
-            <w:proofErr w:type="spellEnd"/>
-            <w:r>
-              <w:rPr>
-                <w:rFonts w:ascii="Times New Roman" w:hAnsi="Times New Roman" w:cs="Times New Roman"/>
-              </w:rPr>
-              <w:t xml:space="preserve"> </w:t>
-            </w:r>
-            <w:proofErr w:type="spellStart"/>
-            <w:r>
-              <w:rPr>
-                <w:rFonts w:ascii="Times New Roman" w:hAnsi="Times New Roman" w:cs="Times New Roman"/>
-              </w:rPr>
-              <w:t>результатов</w:t>
-            </w:r>
-            <w:proofErr w:type="spellEnd"/>
-            <w:r>
-              <w:rPr>
-                <w:rFonts w:ascii="Times New Roman" w:hAnsi="Times New Roman" w:cs="Times New Roman"/>
-              </w:rPr>
-              <w:t xml:space="preserve"> </w:t>
-            </w:r>
-            <w:proofErr w:type="spellStart"/>
-            <w:r>
-              <w:rPr>
-                <w:rFonts w:ascii="Times New Roman" w:hAnsi="Times New Roman" w:cs="Times New Roman"/>
-              </w:rPr>
-              <w:t>экспериментов</w:t>
-            </w:r>
-            <w:proofErr w:type="spellEnd"/>
           </w:p>
         </w:tc>
         <w:tc>
@@ -2357,42 +2460,12 @@
                 <w:rFonts w:ascii="Times New Roman" w:hAnsi="Times New Roman" w:cs="Times New Roman"/>
               </w:rPr>
             </w:pPr>
-            <w:proofErr w:type="spellStart"/>
             <w:r>
               <w:rPr>
                 <w:rFonts w:ascii="Times New Roman" w:hAnsi="Times New Roman" w:cs="Times New Roman"/>
               </w:rPr>
-              <w:t>Оформление</w:t>
+              <w:t>Оформление отчёта и документации</w:t>
             </w:r>
-            <w:proofErr w:type="spellEnd"/>
-            <w:r>
-              <w:rPr>
-                <w:rFonts w:ascii="Times New Roman" w:hAnsi="Times New Roman" w:cs="Times New Roman"/>
-              </w:rPr>
-              <w:t xml:space="preserve"> </w:t>
-            </w:r>
-            <w:proofErr w:type="spellStart"/>
-            <w:r>
-              <w:rPr>
-                <w:rFonts w:ascii="Times New Roman" w:hAnsi="Times New Roman" w:cs="Times New Roman"/>
-              </w:rPr>
-              <w:t>отчёта</w:t>
-            </w:r>
-            <w:proofErr w:type="spellEnd"/>
-            <w:r>
-              <w:rPr>
-                <w:rFonts w:ascii="Times New Roman" w:hAnsi="Times New Roman" w:cs="Times New Roman"/>
-              </w:rPr>
-              <w:t xml:space="preserve"> и </w:t>
-            </w:r>
-            <w:proofErr w:type="spellStart"/>
-            <w:r>
-              <w:rPr>
-                <w:rFonts w:ascii="Times New Roman" w:hAnsi="Times New Roman" w:cs="Times New Roman"/>
-              </w:rPr>
-              <w:t>документации</w:t>
-            </w:r>
-            <w:proofErr w:type="spellEnd"/>
           </w:p>
         </w:tc>
         <w:tc>
@@ -2433,25 +2506,6 @@
           <w:lang w:val="ru-RU"/>
         </w:rPr>
       </w:pPr>
-    </w:p>
-    <w:p>
-      <w:pPr>
-        <w:rPr>
-          <w:rFonts w:ascii="Times New Roman" w:hAnsi="Times New Roman" w:cs="Times New Roman"/>
-          <w:sz w:val="28"/>
-          <w:szCs w:val="28"/>
-          <w:lang w:val="ru-RU"/>
-        </w:rPr>
-      </w:pPr>
-      <w:r>
-        <w:rPr>
-          <w:rFonts w:ascii="Times New Roman" w:hAnsi="Times New Roman" w:cs="Times New Roman"/>
-          <w:sz w:val="28"/>
-          <w:szCs w:val="28"/>
-          <w:lang w:val="ru-RU"/>
-        </w:rPr>
-        <w:t xml:space="preserve"> </w:t>
-      </w:r>
     </w:p>
     <w:p>
       <w:pPr>
@@ -2479,15 +2533,27 @@
     </w:p>
     <w:p>
       <w:pPr>
-        <w:spacing w:before="100" w:beforeAutospacing="1" w:after="100" w:afterAutospacing="1" w:line="240" w:lineRule="auto"/>
         <w:jc w:val="both"/>
         <w:rPr>
           <w:rFonts w:ascii="Times New Roman" w:hAnsi="Times New Roman" w:cs="Times New Roman"/>
+          <w:b/>
+          <w:bCs/>
           <w:sz w:val="28"/>
           <w:szCs w:val="28"/>
           <w:lang w:val="ru-RU"/>
         </w:rPr>
       </w:pPr>
+      <w:r>
+        <w:rPr>
+          <w:rFonts w:ascii="Times New Roman" w:hAnsi="Times New Roman" w:cs="Times New Roman"/>
+          <w:b/>
+          <w:bCs/>
+          <w:sz w:val="28"/>
+          <w:szCs w:val="28"/>
+          <w:lang w:val="ru-RU"/>
+        </w:rPr>
+        <w:t xml:space="preserve">3.1. </w:t>
+      </w:r>
       <w:r>
         <w:rPr>
           <w:rFonts w:ascii="Times New Roman" w:hAnsi="Times New Roman" w:cs="Times New Roman"/>
@@ -2551,18 +2617,33 @@
     </w:p>
     <w:p>
       <w:pPr>
-        <w:spacing w:before="100" w:beforeAutospacing="1" w:after="100" w:afterAutospacing="1" w:line="240" w:lineRule="auto"/>
+        <w:pStyle w:val="aff8"/>
         <w:jc w:val="both"/>
         <w:rPr>
-          <w:rFonts w:ascii="Times New Roman" w:hAnsi="Times New Roman" w:cs="Times New Roman"/>
+          <w:rFonts w:eastAsia="Times New Roman"/>
+          <w:lang w:val="ru-RU" w:eastAsia="ru-RU"/>
+        </w:rPr>
+      </w:pPr>
+      <w:r>
+        <w:rPr>
+          <w:b/>
+          <w:bCs/>
           <w:sz w:val="28"/>
           <w:szCs w:val="28"/>
           <w:lang w:val="ru-RU"/>
         </w:rPr>
-      </w:pPr>
+        <w:t>3.2.</w:t>
+      </w:r>
       <w:r>
         <w:rPr>
-          <w:rFonts w:ascii="Times New Roman" w:hAnsi="Times New Roman" w:cs="Times New Roman"/>
+          <w:sz w:val="28"/>
+          <w:szCs w:val="28"/>
+          <w:lang w:val="ru-RU"/>
+        </w:rPr>
+        <w:t xml:space="preserve"> </w:t>
+      </w:r>
+      <w:r>
+        <w:rPr>
           <w:sz w:val="28"/>
           <w:szCs w:val="28"/>
           <w:lang w:val="ru-RU"/>
@@ -2571,7 +2652,6 @@
       </w:r>
       <w:r>
         <w:rPr>
-          <w:rFonts w:ascii="Times New Roman" w:hAnsi="Times New Roman" w:cs="Times New Roman"/>
           <w:sz w:val="28"/>
           <w:szCs w:val="28"/>
         </w:rPr>
@@ -2579,7 +2659,6 @@
       </w:r>
       <w:r>
         <w:rPr>
-          <w:rFonts w:ascii="Times New Roman" w:hAnsi="Times New Roman" w:cs="Times New Roman"/>
           <w:sz w:val="28"/>
           <w:szCs w:val="28"/>
           <w:lang w:val="ru-RU"/>
@@ -2588,7 +2667,6 @@
       </w:r>
       <w:r>
         <w:rPr>
-          <w:rFonts w:ascii="Times New Roman" w:hAnsi="Times New Roman" w:cs="Times New Roman"/>
           <w:sz w:val="28"/>
           <w:szCs w:val="28"/>
         </w:rPr>
@@ -2596,22 +2674,72 @@
       </w:r>
       <w:r>
         <w:rPr>
-          <w:rFonts w:ascii="Times New Roman" w:hAnsi="Times New Roman" w:cs="Times New Roman"/>
           <w:sz w:val="28"/>
           <w:szCs w:val="28"/>
           <w:lang w:val="ru-RU"/>
         </w:rPr>
-        <w:t xml:space="preserve">-трудных) задач, в связи с чем в исследовании приоритет отдается эвристическим и приближённым методам, ориентированным </w:t>
+        <w:t xml:space="preserve">-трудных) задач, в связи с чем в исследовании приоритет отдается эвристическим и приближённым </w:t>
       </w:r>
       <w:r>
         <w:rPr>
-          <w:rFonts w:ascii="Times New Roman" w:hAnsi="Times New Roman" w:cs="Times New Roman"/>
           <w:sz w:val="28"/>
           <w:szCs w:val="28"/>
           <w:lang w:val="ru-RU"/>
         </w:rPr>
         <w:lastRenderedPageBreak/>
-        <w:t>на получение качественных решений за ограниченное время. Точные алгоритмы рассматриваются лишь в вспомогательной роли — преимущественно для малых по размеру инстансов или в качестве ориентиров при оценке качества решений. Одним из ключевых ограничений проекта является возможный резкий рост вычислительных затрат при увеличении числа депо, агентов и обслуживаемых вершин, что может существенно осложнять проведение масштабных вычислительных экспериментов. В этой связи в работе вводятся ограничения на вычислительный бюджет (по времени и/или числу итераций), а также применяется структурированный подбор тестовых наборов, охватывающих малые, средние и крупные сценарии, с контролем числа прогонов.</w:t>
+        <w:t xml:space="preserve">методам, ориентированным на получение качественных решений за ограниченное время. </w:t>
+      </w:r>
+      <w:r>
+        <w:rPr>
+          <w:rFonts w:eastAsia="Times New Roman"/>
+          <w:sz w:val="28"/>
+          <w:szCs w:val="28"/>
+          <w:lang w:val="ru-RU" w:eastAsia="ru-RU"/>
+        </w:rPr>
+        <w:t>Точные алгоритмы рассматриваются лишь в вспомогательной роли и применяются в основном для малых по размеру инстансов или как ориентир при оценке качества полученных решений.</w:t>
+      </w:r>
+      <w:r>
+        <w:rPr>
+          <w:rFonts w:eastAsia="Times New Roman"/>
+          <w:lang w:val="ru-RU" w:eastAsia="ru-RU"/>
+        </w:rPr>
+        <w:t xml:space="preserve"> </w:t>
+      </w:r>
+    </w:p>
+    <w:p>
+      <w:pPr>
+        <w:pStyle w:val="aff8"/>
+        <w:jc w:val="both"/>
+        <w:rPr>
+          <w:rFonts w:eastAsia="Times New Roman"/>
+          <w:lang w:val="ru-RU" w:eastAsia="ru-RU"/>
+        </w:rPr>
+      </w:pPr>
+      <w:r>
+        <w:rPr>
+          <w:b/>
+          <w:bCs/>
+          <w:sz w:val="28"/>
+          <w:szCs w:val="28"/>
+          <w:lang w:val="ru-RU"/>
+        </w:rPr>
+        <w:t>3.3.</w:t>
+      </w:r>
+      <w:r>
+        <w:rPr>
+          <w:sz w:val="28"/>
+          <w:szCs w:val="28"/>
+          <w:lang w:val="ru-RU"/>
+        </w:rPr>
+        <w:t xml:space="preserve"> </w:t>
+      </w:r>
+      <w:r>
+        <w:rPr>
+          <w:sz w:val="28"/>
+          <w:szCs w:val="28"/>
+          <w:lang w:val="ru-RU"/>
+        </w:rPr>
+        <w:t>Одним из ключевых ограничений проекта является возможный резкий рост вычислительных затрат при увеличении числа депо, агентов и обслуживаемых вершин, что может существенно осложнять проведение масштабных вычислительных экспериментов. В этой связи в работе вводятся ограничения на вычислительный бюджет (по времени и/или числу итераций), а также применяется структурированный подбор тестовых наборов, охватывающих малые, средние и крупные сценарии, с контролем числа прогонов.</w:t>
       </w:r>
     </w:p>
     <w:p>
@@ -2625,6 +2753,26 @@
           <w:lang w:val="ru-RU" w:eastAsia="ru-RU"/>
         </w:rPr>
       </w:pPr>
+      <w:r>
+        <w:rPr>
+          <w:rFonts w:ascii="Times New Roman" w:eastAsia="Times New Roman" w:hAnsi="Times New Roman" w:cs="Times New Roman"/>
+          <w:b/>
+          <w:bCs/>
+          <w:sz w:val="28"/>
+          <w:szCs w:val="28"/>
+          <w:lang w:val="ru-RU" w:eastAsia="ru-RU"/>
+        </w:rPr>
+        <w:t>3.4.</w:t>
+      </w:r>
+      <w:r>
+        <w:rPr>
+          <w:rFonts w:ascii="Times New Roman" w:eastAsia="Times New Roman" w:hAnsi="Times New Roman" w:cs="Times New Roman"/>
+          <w:sz w:val="28"/>
+          <w:szCs w:val="28"/>
+          <w:lang w:val="ru-RU" w:eastAsia="ru-RU"/>
+        </w:rPr>
+        <w:t xml:space="preserve"> </w:t>
+      </w:r>
       <w:r>
         <w:rPr>
           <w:rFonts w:ascii="Times New Roman" w:eastAsia="Times New Roman" w:hAnsi="Times New Roman" w:cs="Times New Roman"/>

</xml_diff>